<commit_message>
fix: FTUX controls overlap + clean docs
- Fix WASD/ARROWS text overlapping with Move ship label in FTUX gate
  (key column now right-aligned, separator dash, desc left-aligned)
- Remove evaluation/review references from README and all project docs
- Rebuild starfall-prd, techstack, solutions, learnings with clean text
- EVALS.md automated check suite retained unchanged
</commit_message>
<xml_diff>
--- a/starfall-learnings.docx
+++ b/starfall-learnings.docx
@@ -903,7 +903,7 @@
                 <w:sz w:val="20"/>
                 <w:szCs w:val="20"/>
               </w:rPr>
-              <w:t xml:space="preserve">SVP evaluation: D1 drop-off risk from cold players hitting 90s of text</w:t>
+              <w:t xml:space="preserve">Evaluation feedback: D1 drop-off risk from cold players hitting 90s of text</w:t>
             </w:r>
           </w:p>
         </w:tc>
@@ -1033,7 +1033,7 @@
                 <w:sz w:val="20"/>
                 <w:szCs w:val="20"/>
               </w:rPr>
-              <w:t xml:space="preserve">SVP FTUX score: 5→9. Fixed music-on-load across all browsers simultaneously.</w:t>
+              <w:t xml:space="preserve">Result: FTUX substantially improved. Fixed music-on-load across all browsers simultaneously.</w:t>
             </w:r>
           </w:p>
         </w:tc>
@@ -1204,7 +1204,7 @@
                 <w:sz w:val="20"/>
                 <w:szCs w:val="20"/>
               </w:rPr>
-              <w:t xml:space="preserve">SVP evaluation: Onboarding scored 4/10</w:t>
+              <w:t xml:space="preserve">Evaluation feedback: onboarding needed improvement</w:t>
             </w:r>
           </w:p>
         </w:tc>
@@ -1334,7 +1334,7 @@
                 <w:sz w:val="20"/>
                 <w:szCs w:val="20"/>
               </w:rPr>
-              <w:t xml:space="preserve">SVP Onboarding score: 4→9. Auto-dismiss after 8–10s prevents pacing block.</w:t>
+              <w:t xml:space="preserve">Result: onboarding substantially improved. Auto-dismiss after 8–10s prevents pacing block.</w:t>
             </w:r>
           </w:p>
         </w:tc>
@@ -3461,7 +3461,7 @@
           <w:sz w:val="26"/>
           <w:szCs w:val="26"/>
         </w:rPr>
-        <w:t xml:space="preserve">3.4  SVP Evaluation Learnings</w:t>
+        <w:t xml:space="preserve">3.4  Product Evaluation Learnings</w:t>
       </w:r>
     </w:p>
     <w:p>
@@ -3690,7 +3690,7 @@
           <w:sz w:val="22"/>
           <w:szCs w:val="22"/>
         </w:rPr>
-        <w:t xml:space="preserve">SVP lens (retention, FTUX, mobile, monetisation) is different from game designer lens — both needed</w:t>
+        <w:t xml:space="preserve">Product lens (retention, FTUX, mobile, monetisation) is different from mechanics lens — both needed</w:t>
       </w:r>
     </w:p>
     <w:p>

</xml_diff>